<commit_message>
docs: correct GPU node pool status — blocked by account vCPU quota, not a config issue
Co-Authored-By: Claude Sonnet 5 <noreply@anthropic.com>
</commit_message>
<xml_diff>
--- a/docs/NutriAI-ALB-GPU-Bedrock-Guide.docx
+++ b/docs/NutriAI-ALB-GPU-Bedrock-Guide.docx
@@ -288,7 +288,7 @@
                 <w:sz w:val="20"/>
                 <w:szCs w:val="20"/>
               </w:rPr>
-              <w:t xml:space="preserve">Provisioning — see §6, run verify command</w:t>
+              <w:t xml:space="preserve">BLOCKED — 0 vCPU quota on account, increase requested (PENDING), see §6</w:t>
             </w:r>
           </w:p>
         </w:tc>
@@ -1108,7 +1108,50 @@
         <w:spacing w:after="150" w:before="300"/>
       </w:pPr>
       <w:r>
-        <w:t xml:space="preserve">6. GPU node pool</w:t>
+        <w:t xml:space="preserve">6. GPU node pool — BLOCKED by an AWS account quota, not a config issue</w:t>
+      </w:r>
+    </w:p>
+    <w:p>
+      <w:pPr>
+        <w:spacing w:after="100"/>
+      </w:pPr>
+      <w:r>
+        <w:t xml:space="preserve">The nodegroup was created (g4dn.xlarge, 1x NVIDIA T4 16GB, min=max=1, workload=ai label — helm/nutriai/values.yaml already has the nodeSelector+toleration wired to diet-service and document-service), but every EC2 launch attempt failed with:</w:t>
+      </w:r>
+    </w:p>
+    <w:p>
+      <w:pPr>
+        <w:pBdr>
+          <w:left w:val="single" w:color="4A7C59" w:sz="12"/>
+        </w:pBdr>
+        <w:shd w:fill="F0F0F0" w:val="clear"/>
+        <w:spacing w:after="120" w:before="80"/>
+        <w:ind w:left="200"/>
+      </w:pPr>
+      <w:r>
+        <w:rPr>
+          <w:rFonts w:ascii="Consolas" w:cs="Consolas" w:eastAsia="Consolas" w:hAnsi="Consolas"/>
+          <w:sz w:val="18"/>
+          <w:szCs w:val="18"/>
+        </w:rPr>
+        <w:t xml:space="preserve">VcpuLimitExceeded: You have requested more vCPU capacity than your current vCPU limit of 0 allows for the instance bucket that the specified instance type belongs to.</w:t>
+      </w:r>
+    </w:p>
+    <w:p>
+      <w:pPr>
+        <w:spacing w:after="100"/>
+      </w:pPr>
+      <w:r>
+        <w:t xml:space="preserve">This AWS account has a service quota of 0 for GPU (G/VT family) on-demand instances — the standard default for new/lightly-used accounts. It has nothing to do with the Kubernetes/Helm configuration, which is correct and ready to go the moment the quota is raised. The failed nodegroup attempt was deleted cleanly — confirmed no orphaned EC2 instances and no ongoing cost from it.</w:t>
+      </w:r>
+    </w:p>
+    <w:p>
+      <w:pPr>
+        <w:pStyle w:val="Heading2"/>
+        <w:spacing w:after="120" w:before="250"/>
+      </w:pPr>
+      <w:r>
+        <w:t xml:space="preserve">Quota increase — already requested</w:t>
       </w:r>
     </w:p>
     <w:tbl>
@@ -1124,13 +1167,13 @@
         </w:tblBorders>
       </w:tblPr>
       <w:tblGrid>
-        <w:gridCol w:w="4000"/>
-        <w:gridCol w:w="6000"/>
+        <w:gridCol w:w="3500"/>
+        <w:gridCol w:w="6500"/>
       </w:tblGrid>
       <w:tr>
         <w:tc>
           <w:tcPr>
-            <w:tcW w:type="dxa" w:w="4000"/>
+            <w:tcW w:type="dxa" w:w="3500"/>
             <w:shd w:fill="4A7C59" w:val="clear"/>
           </w:tcPr>
           <w:p>
@@ -1142,13 +1185,13 @@
                 <w:sz w:val="20"/>
                 <w:szCs w:val="20"/>
               </w:rPr>
-              <w:t xml:space="preserve">Setting</w:t>
-            </w:r>
-          </w:p>
-        </w:tc>
-        <w:tc>
-          <w:tcPr>
-            <w:tcW w:type="dxa" w:w="6000"/>
+              <w:t xml:space="preserve">Field</w:t>
+            </w:r>
+          </w:p>
+        </w:tc>
+        <w:tc>
+          <w:tcPr>
+            <w:tcW w:type="dxa" w:w="6500"/>
             <w:shd w:fill="4A7C59" w:val="clear"/>
           </w:tcPr>
           <w:p>
@@ -1168,203 +1211,169 @@
       <w:tr>
         <w:tc>
           <w:tcPr>
-            <w:tcW w:type="dxa" w:w="4000"/>
-          </w:tcPr>
-          <w:p>
-            <w:r>
-              <w:rPr>
-                <w:b w:val="false"/>
-                <w:bCs w:val="false"/>
-                <w:sz w:val="20"/>
-                <w:szCs w:val="20"/>
-              </w:rPr>
-              <w:t xml:space="preserve">Node group name</w:t>
-            </w:r>
-          </w:p>
-        </w:tc>
-        <w:tc>
-          <w:tcPr>
-            <w:tcW w:type="dxa" w:w="6000"/>
-          </w:tcPr>
-          <w:p>
-            <w:r>
-              <w:rPr>
-                <w:b w:val="false"/>
-                <w:bCs w:val="false"/>
-                <w:sz w:val="20"/>
-                <w:szCs w:val="20"/>
-              </w:rPr>
-              <w:t xml:space="preserve">gpu-ai-workloads</w:t>
-            </w:r>
-          </w:p>
-        </w:tc>
-      </w:tr>
-      <w:tr>
-        <w:tc>
-          <w:tcPr>
-            <w:tcW w:type="dxa" w:w="4000"/>
-          </w:tcPr>
-          <w:p>
-            <w:r>
-              <w:rPr>
-                <w:b w:val="false"/>
-                <w:bCs w:val="false"/>
-                <w:sz w:val="20"/>
-                <w:szCs w:val="20"/>
-              </w:rPr>
-              <w:t xml:space="preserve">Instance type</w:t>
-            </w:r>
-          </w:p>
-        </w:tc>
-        <w:tc>
-          <w:tcPr>
-            <w:tcW w:type="dxa" w:w="6000"/>
-          </w:tcPr>
-          <w:p>
-            <w:r>
-              <w:rPr>
-                <w:b w:val="false"/>
-                <w:bCs w:val="false"/>
-                <w:sz w:val="20"/>
-                <w:szCs w:val="20"/>
-              </w:rPr>
-              <w:t xml:space="preserve">g4dn.xlarge (1x NVIDIA T4, 16GB)</w:t>
-            </w:r>
-          </w:p>
-        </w:tc>
-      </w:tr>
-      <w:tr>
-        <w:tc>
-          <w:tcPr>
-            <w:tcW w:type="dxa" w:w="4000"/>
-          </w:tcPr>
-          <w:p>
-            <w:r>
-              <w:rPr>
-                <w:b w:val="false"/>
-                <w:bCs w:val="false"/>
-                <w:sz w:val="20"/>
-                <w:szCs w:val="20"/>
-              </w:rPr>
-              <w:t xml:space="preserve">Min / Max / Desired</w:t>
-            </w:r>
-          </w:p>
-        </w:tc>
-        <w:tc>
-          <w:tcPr>
-            <w:tcW w:type="dxa" w:w="6000"/>
-          </w:tcPr>
-          <w:p>
-            <w:r>
-              <w:rPr>
-                <w:b w:val="false"/>
-                <w:bCs w:val="false"/>
-                <w:sz w:val="20"/>
-                <w:szCs w:val="20"/>
-              </w:rPr>
-              <w:t xml:space="preserve">1 / 1 / 1 (always-on — not scale-to-zero; see cost note)</w:t>
-            </w:r>
-          </w:p>
-        </w:tc>
-      </w:tr>
-      <w:tr>
-        <w:tc>
-          <w:tcPr>
-            <w:tcW w:type="dxa" w:w="4000"/>
-          </w:tcPr>
-          <w:p>
-            <w:r>
-              <w:rPr>
-                <w:b w:val="false"/>
-                <w:bCs w:val="false"/>
-                <w:sz w:val="20"/>
-                <w:szCs w:val="20"/>
-              </w:rPr>
-              <w:t xml:space="preserve">Labels</w:t>
-            </w:r>
-          </w:p>
-        </w:tc>
-        <w:tc>
-          <w:tcPr>
-            <w:tcW w:type="dxa" w:w="6000"/>
-          </w:tcPr>
-          <w:p>
-            <w:r>
-              <w:rPr>
-                <w:b w:val="false"/>
-                <w:bCs w:val="false"/>
-                <w:sz w:val="20"/>
-                <w:szCs w:val="20"/>
-              </w:rPr>
-              <w:t xml:space="preserve">workload=ai</w:t>
-            </w:r>
-          </w:p>
-        </w:tc>
-      </w:tr>
-      <w:tr>
-        <w:tc>
-          <w:tcPr>
-            <w:tcW w:type="dxa" w:w="4000"/>
-          </w:tcPr>
-          <w:p>
-            <w:r>
-              <w:rPr>
-                <w:b w:val="false"/>
-                <w:bCs w:val="false"/>
-                <w:sz w:val="20"/>
-                <w:szCs w:val="20"/>
-              </w:rPr>
-              <w:t xml:space="preserve">Scheduling</w:t>
-            </w:r>
-          </w:p>
-        </w:tc>
-        <w:tc>
-          <w:tcPr>
-            <w:tcW w:type="dxa" w:w="6000"/>
-          </w:tcPr>
-          <w:p>
-            <w:r>
-              <w:rPr>
-                <w:b w:val="false"/>
-                <w:bCs w:val="false"/>
-                <w:sz w:val="20"/>
-                <w:szCs w:val="20"/>
-              </w:rPr>
-              <w:t xml:space="preserve">Services with gpu: true in helm/nutriai/values.yaml get a matching nodeSelector + toleration</w:t>
-            </w:r>
-          </w:p>
-        </w:tc>
-      </w:tr>
-      <w:tr>
-        <w:tc>
-          <w:tcPr>
-            <w:tcW w:type="dxa" w:w="4000"/>
-          </w:tcPr>
-          <w:p>
-            <w:r>
-              <w:rPr>
-                <w:b w:val="false"/>
-                <w:bCs w:val="false"/>
-                <w:sz w:val="20"/>
-                <w:szCs w:val="20"/>
-              </w:rPr>
-              <w:t xml:space="preserve">Services currently targeted</w:t>
-            </w:r>
-          </w:p>
-        </w:tc>
-        <w:tc>
-          <w:tcPr>
-            <w:tcW w:type="dxa" w:w="6000"/>
-          </w:tcPr>
-          <w:p>
-            <w:r>
-              <w:rPr>
-                <w:b w:val="false"/>
-                <w:bCs w:val="false"/>
-                <w:sz w:val="20"/>
-                <w:szCs w:val="20"/>
-              </w:rPr>
-              <w:t xml:space="preserve">diet-service, document-service</w:t>
+            <w:tcW w:type="dxa" w:w="3500"/>
+          </w:tcPr>
+          <w:p>
+            <w:r>
+              <w:rPr>
+                <w:b w:val="false"/>
+                <w:bCs w:val="false"/>
+                <w:sz w:val="20"/>
+                <w:szCs w:val="20"/>
+              </w:rPr>
+              <w:t xml:space="preserve">Quota</w:t>
+            </w:r>
+          </w:p>
+        </w:tc>
+        <w:tc>
+          <w:tcPr>
+            <w:tcW w:type="dxa" w:w="6500"/>
+          </w:tcPr>
+          <w:p>
+            <w:r>
+              <w:rPr>
+                <w:b w:val="false"/>
+                <w:bCs w:val="false"/>
+                <w:sz w:val="20"/>
+                <w:szCs w:val="20"/>
+              </w:rPr>
+              <w:t xml:space="preserve">Running On-Demand G and VT instances</w:t>
+            </w:r>
+          </w:p>
+        </w:tc>
+      </w:tr>
+      <w:tr>
+        <w:tc>
+          <w:tcPr>
+            <w:tcW w:type="dxa" w:w="3500"/>
+          </w:tcPr>
+          <w:p>
+            <w:r>
+              <w:rPr>
+                <w:b w:val="false"/>
+                <w:bCs w:val="false"/>
+                <w:sz w:val="20"/>
+                <w:szCs w:val="20"/>
+              </w:rPr>
+              <w:t xml:space="preserve">Quota code</w:t>
+            </w:r>
+          </w:p>
+        </w:tc>
+        <w:tc>
+          <w:tcPr>
+            <w:tcW w:type="dxa" w:w="6500"/>
+          </w:tcPr>
+          <w:p>
+            <w:r>
+              <w:rPr>
+                <w:b w:val="false"/>
+                <w:bCs w:val="false"/>
+                <w:sz w:val="20"/>
+                <w:szCs w:val="20"/>
+              </w:rPr>
+              <w:t xml:space="preserve">L-DB2E81BA</w:t>
+            </w:r>
+          </w:p>
+        </w:tc>
+      </w:tr>
+      <w:tr>
+        <w:tc>
+          <w:tcPr>
+            <w:tcW w:type="dxa" w:w="3500"/>
+          </w:tcPr>
+          <w:p>
+            <w:r>
+              <w:rPr>
+                <w:b w:val="false"/>
+                <w:bCs w:val="false"/>
+                <w:sz w:val="20"/>
+                <w:szCs w:val="20"/>
+              </w:rPr>
+              <w:t xml:space="preserve">Current value</w:t>
+            </w:r>
+          </w:p>
+        </w:tc>
+        <w:tc>
+          <w:tcPr>
+            <w:tcW w:type="dxa" w:w="6500"/>
+          </w:tcPr>
+          <w:p>
+            <w:r>
+              <w:rPr>
+                <w:b w:val="false"/>
+                <w:bCs w:val="false"/>
+                <w:sz w:val="20"/>
+                <w:szCs w:val="20"/>
+              </w:rPr>
+              <w:t xml:space="preserve">0 vCPUs</w:t>
+            </w:r>
+          </w:p>
+        </w:tc>
+      </w:tr>
+      <w:tr>
+        <w:tc>
+          <w:tcPr>
+            <w:tcW w:type="dxa" w:w="3500"/>
+          </w:tcPr>
+          <w:p>
+            <w:r>
+              <w:rPr>
+                <w:b w:val="false"/>
+                <w:bCs w:val="false"/>
+                <w:sz w:val="20"/>
+                <w:szCs w:val="20"/>
+              </w:rPr>
+              <w:t xml:space="preserve">Requested value</w:t>
+            </w:r>
+          </w:p>
+        </w:tc>
+        <w:tc>
+          <w:tcPr>
+            <w:tcW w:type="dxa" w:w="6500"/>
+          </w:tcPr>
+          <w:p>
+            <w:r>
+              <w:rPr>
+                <w:b w:val="false"/>
+                <w:bCs w:val="false"/>
+                <w:sz w:val="20"/>
+                <w:szCs w:val="20"/>
+              </w:rPr>
+              <w:t xml:space="preserve">8 vCPUs (covers one g4dn.xlarge = 4 vCPUs, plus headroom)</w:t>
+            </w:r>
+          </w:p>
+        </w:tc>
+      </w:tr>
+      <w:tr>
+        <w:tc>
+          <w:tcPr>
+            <w:tcW w:type="dxa" w:w="3500"/>
+          </w:tcPr>
+          <w:p>
+            <w:r>
+              <w:rPr>
+                <w:b w:val="false"/>
+                <w:bCs w:val="false"/>
+                <w:sz w:val="20"/>
+                <w:szCs w:val="20"/>
+              </w:rPr>
+              <w:t xml:space="preserve">Status at time of writing</w:t>
+            </w:r>
+          </w:p>
+        </w:tc>
+        <w:tc>
+          <w:tcPr>
+            <w:tcW w:type="dxa" w:w="6500"/>
+          </w:tcPr>
+          <w:p>
+            <w:r>
+              <w:rPr>
+                <w:b w:val="false"/>
+                <w:bCs w:val="false"/>
+                <w:sz w:val="20"/>
+                <w:szCs w:val="20"/>
+              </w:rPr>
+              <w:t xml:space="preserve">PENDING — AWS review, usually minutes to a day for a small increase like this</w:t>
             </w:r>
           </w:p>
         </w:tc>
@@ -1372,10 +1381,11 @@
     </w:tbl>
     <w:p>
       <w:pPr>
-        <w:spacing w:after="100"/>
-      </w:pPr>
-      <w:r>
-        <w:t xml:space="preserve">COST NOTE: g4dn.xlarge is approximately $0.53/hr on-demand in us-east-1 (~$380/month if left running continuously). min=max=1 keeps it simple for a lab but means it runs 24/7 until you scale it down. To stop billing when not in use:</w:t>
+        <w:pStyle w:val="Heading2"/>
+        <w:spacing w:after="120" w:before="250"/>
+      </w:pPr>
+      <w:r>
+        <w:t xml:space="preserve">Check request status</w:t>
       </w:r>
     </w:p>
     <w:p>
@@ -1393,16 +1403,16 @@
           <w:sz w:val="18"/>
           <w:szCs w:val="18"/>
         </w:rPr>
-        <w:t xml:space="preserve">eksctl scale nodegroup --cluster murali-test-cluster --name gpu-ai-workloads --nodes 0 --nodes-min 0 --region us-east-1</w:t>
-      </w:r>
-    </w:p>
-    <w:p>
-      <w:pPr>
-        <w:pStyle w:val="Heading2"/>
-        <w:spacing w:after="120" w:before="250"/>
-      </w:pPr>
-      <w:r>
-        <w:t xml:space="preserve">Verify it joined the cluster</w:t>
+        <w:t xml:space="preserve">aws service-quotas list-requested-service-quota-change-history --service-code ec2 --region us-east-1 --query "RequestedQuotas[?QuotaCode=='L-DB2E81BA'].{Status:Status,Desired:DesiredValue}"</w:t>
+      </w:r>
+    </w:p>
+    <w:p>
+      <w:pPr>
+        <w:pStyle w:val="Heading2"/>
+        <w:spacing w:after="120" w:before="250"/>
+      </w:pPr>
+      <w:r>
+        <w:t xml:space="preserve">Once APPROVED — recreate the node group</w:t>
       </w:r>
     </w:p>
     <w:p>
@@ -1420,6 +1430,87 @@
           <w:sz w:val="18"/>
           <w:szCs w:val="18"/>
         </w:rPr>
+        <w:t xml:space="preserve">eksctl create nodegroup \</w:t>
+      </w:r>
+      <w:r>
+        <w:rPr>
+          <w:rFonts w:ascii="Consolas" w:cs="Consolas" w:eastAsia="Consolas" w:hAnsi="Consolas"/>
+          <w:sz w:val="18"/>
+          <w:szCs w:val="18"/>
+        </w:rPr>
+        <w:br/>
+        <w:t xml:space="preserve">  --cluster murali-test-cluster --region us-east-1 \</w:t>
+      </w:r>
+      <w:r>
+        <w:rPr>
+          <w:rFonts w:ascii="Consolas" w:cs="Consolas" w:eastAsia="Consolas" w:hAnsi="Consolas"/>
+          <w:sz w:val="18"/>
+          <w:szCs w:val="18"/>
+        </w:rPr>
+        <w:br/>
+        <w:t xml:space="preserve">  --name gpu-ai-workloads \</w:t>
+      </w:r>
+      <w:r>
+        <w:rPr>
+          <w:rFonts w:ascii="Consolas" w:cs="Consolas" w:eastAsia="Consolas" w:hAnsi="Consolas"/>
+          <w:sz w:val="18"/>
+          <w:szCs w:val="18"/>
+        </w:rPr>
+        <w:br/>
+        <w:t xml:space="preserve">  --node-type g4dn.xlarge \</w:t>
+      </w:r>
+      <w:r>
+        <w:rPr>
+          <w:rFonts w:ascii="Consolas" w:cs="Consolas" w:eastAsia="Consolas" w:hAnsi="Consolas"/>
+          <w:sz w:val="18"/>
+          <w:szCs w:val="18"/>
+        </w:rPr>
+        <w:br/>
+        <w:t xml:space="preserve">  --nodes 1 --nodes-min 1 --nodes-max 1 \</w:t>
+      </w:r>
+      <w:r>
+        <w:rPr>
+          <w:rFonts w:ascii="Consolas" w:cs="Consolas" w:eastAsia="Consolas" w:hAnsi="Consolas"/>
+          <w:sz w:val="18"/>
+          <w:szCs w:val="18"/>
+        </w:rPr>
+        <w:br/>
+        <w:t xml:space="preserve">  --node-labels "workload=ai,nvidia.com/gpu=true" \</w:t>
+      </w:r>
+      <w:r>
+        <w:rPr>
+          <w:rFonts w:ascii="Consolas" w:cs="Consolas" w:eastAsia="Consolas" w:hAnsi="Consolas"/>
+          <w:sz w:val="18"/>
+          <w:szCs w:val="18"/>
+        </w:rPr>
+        <w:br/>
+        <w:t xml:space="preserve">  --node-private-networking --managed</w:t>
+      </w:r>
+    </w:p>
+    <w:p>
+      <w:pPr>
+        <w:pStyle w:val="Heading2"/>
+        <w:spacing w:after="120" w:before="250"/>
+      </w:pPr>
+      <w:r>
+        <w:t xml:space="preserve">Verify it joined the cluster</w:t>
+      </w:r>
+    </w:p>
+    <w:p>
+      <w:pPr>
+        <w:pBdr>
+          <w:left w:val="single" w:color="4A7C59" w:sz="12"/>
+        </w:pBdr>
+        <w:shd w:fill="F0F0F0" w:val="clear"/>
+        <w:spacing w:after="120" w:before="80"/>
+        <w:ind w:left="200"/>
+      </w:pPr>
+      <w:r>
+        <w:rPr>
+          <w:rFonts w:ascii="Consolas" w:cs="Consolas" w:eastAsia="Consolas" w:hAnsi="Consolas"/>
+          <w:sz w:val="18"/>
+          <w:szCs w:val="18"/>
+        </w:rPr>
         <w:t xml:space="preserve">kubectl get nodes -l workload=ai -o wide</w:t>
       </w:r>
     </w:p>
@@ -1428,7 +1519,25 @@
         <w:spacing w:after="100"/>
       </w:pPr>
       <w:r>
-        <w:t xml:space="preserve">If it was still provisioning when this document was generated, that command will show nothing yet — GPU nodes take longer than regular ones (NVIDIA driver bootstrap). Re-run in a few minutes.</w:t>
+        <w:t xml:space="preserve">COST NOTE once it is running: g4dn.xlarge is approximately $0.53/hr on-demand in us-east-1 (~$380/month continuous). min=max=1 is always-on, not scale-to-zero. To stop billing when not in use:</w:t>
+      </w:r>
+    </w:p>
+    <w:p>
+      <w:pPr>
+        <w:pBdr>
+          <w:left w:val="single" w:color="4A7C59" w:sz="12"/>
+        </w:pBdr>
+        <w:shd w:fill="F0F0F0" w:val="clear"/>
+        <w:spacing w:after="120" w:before="80"/>
+        <w:ind w:left="200"/>
+      </w:pPr>
+      <w:r>
+        <w:rPr>
+          <w:rFonts w:ascii="Consolas" w:cs="Consolas" w:eastAsia="Consolas" w:hAnsi="Consolas"/>
+          <w:sz w:val="18"/>
+          <w:szCs w:val="18"/>
+        </w:rPr>
+        <w:t xml:space="preserve">eksctl scale nodegroup --cluster murali-test-cluster --name gpu-ai-workloads --nodes 0 --nodes-min 0 --region us-east-1</w:t>
       </w:r>
     </w:p>
     <w:p>

</xml_diff>